<commit_message>
feat(viceri-study): publish specification and test suite v1.4
</commit_message>
<xml_diff>
--- a/output/docx/AdministradorAdicionaCompatibilidade.docx
+++ b/output/docx/AdministradorAdicionaCompatibilidade.docx
@@ -197,17 +197,17 @@
               <w:rPr>
                 <w:sz w:val="18"/>
               </w:rPr>
-              <w:t>Administrador: abre tela inicial do sistema</w:t>
-            </w:r>
-          </w:p>
-        </w:tc>
-        <w:tc>
-          <w:p>
-            <w:r>
-              <w:rPr>
-                <w:sz w:val="18"/>
-              </w:rPr>
-              <w:t>SYSTEM exibe tela inicial do sistema</w:t>
+              <w:t>Administrador: Clicar na opcao 'Compatibilidade' no menu da tela principal</w:t>
+            </w:r>
+          </w:p>
+        </w:tc>
+        <w:tc>
+          <w:p>
+            <w:r>
+              <w:rPr>
+                <w:sz w:val="18"/>
+              </w:rPr>
+              <w:t>SYSTEM exibe a tela de listagem das Compatibilidades</w:t>
             </w:r>
           </w:p>
         </w:tc>
@@ -229,17 +229,17 @@
               <w:rPr>
                 <w:sz w:val="18"/>
               </w:rPr>
-              <w:t>Administrador: clica na opcao 'Compatibilidade' no menu da tela principal</w:t>
-            </w:r>
-          </w:p>
-        </w:tc>
-        <w:tc>
-          <w:p>
-            <w:r>
-              <w:rPr>
-                <w:sz w:val="18"/>
-              </w:rPr>
-              <w:t>SYSTEM exibe a tela de listagem das Compatibilidades</w:t>
+              <w:t>Administrador: clica em 'Adicionar Compatibilidade'</w:t>
+            </w:r>
+          </w:p>
+        </w:tc>
+        <w:tc>
+          <w:p>
+            <w:r>
+              <w:rPr>
+                <w:sz w:val="18"/>
+              </w:rPr>
+              <w:t>SYSTEM exibe a tela de cadastro de Compatibilidade</w:t>
             </w:r>
           </w:p>
         </w:tc>
@@ -252,38 +252,6 @@
                 <w:sz w:val="18"/>
               </w:rPr>
               <w:t>3</w:t>
-            </w:r>
-          </w:p>
-        </w:tc>
-        <w:tc>
-          <w:p>
-            <w:r>
-              <w:rPr>
-                <w:sz w:val="18"/>
-              </w:rPr>
-              <w:t>Administrador: clica em 'Adicionar Compatibilidade'</w:t>
-            </w:r>
-          </w:p>
-        </w:tc>
-        <w:tc>
-          <w:p>
-            <w:r>
-              <w:rPr>
-                <w:sz w:val="18"/>
-              </w:rPr>
-              <w:t>SYSTEM exibe a tela de cadastro de Compatibilidade</w:t>
-            </w:r>
-          </w:p>
-        </w:tc>
-      </w:tr>
-      <w:tr>
-        <w:tc>
-          <w:p>
-            <w:r>
-              <w:rPr>
-                <w:sz w:val="18"/>
-              </w:rPr>
-              <w:t>4</w:t>
             </w:r>
           </w:p>
         </w:tc>
@@ -451,17 +419,17 @@
               <w:rPr>
                 <w:sz w:val="18"/>
               </w:rPr>
-              <w:t>Administrador: abre tela inicial do sistema</w:t>
-            </w:r>
-          </w:p>
-        </w:tc>
-        <w:tc>
-          <w:p>
-            <w:r>
-              <w:rPr>
-                <w:sz w:val="18"/>
-              </w:rPr>
-              <w:t>SYSTEM exibe tela inicial do sistema</w:t>
+              <w:t>Administrador: Clicar na opcao 'Compatibilidade' no menu da tela principal</w:t>
+            </w:r>
+          </w:p>
+        </w:tc>
+        <w:tc>
+          <w:p>
+            <w:r>
+              <w:rPr>
+                <w:sz w:val="18"/>
+              </w:rPr>
+              <w:t>SYSTEM exibe a tela de listagem das Compatibilidades</w:t>
             </w:r>
           </w:p>
         </w:tc>
@@ -483,7 +451,7 @@
               <w:rPr>
                 <w:sz w:val="18"/>
               </w:rPr>
-              <w:t>Administrador: clica na opcao 'Compatibilidade' no menu da tela principal</w:t>
+              <w:t>Administrador: clica no botao Voltar</w:t>
             </w:r>
           </w:p>
         </w:tc>
@@ -515,17 +483,17 @@
               <w:rPr>
                 <w:sz w:val="18"/>
               </w:rPr>
-              <w:t>Administrador: clica no botao 'Voltar'</w:t>
-            </w:r>
-          </w:p>
-        </w:tc>
-        <w:tc>
-          <w:p>
-            <w:r>
-              <w:rPr>
-                <w:sz w:val="18"/>
-              </w:rPr>
-              <w:t>SYSTEM exibe a tela de listagem das Compatibilidades</w:t>
+              <w:t>Administrador: clica em 'Adicionar Compatibilidade'</w:t>
+            </w:r>
+          </w:p>
+        </w:tc>
+        <w:tc>
+          <w:p>
+            <w:r>
+              <w:rPr>
+                <w:sz w:val="18"/>
+              </w:rPr>
+              <w:t>SYSTEM exibe a tela de cadastro de Compatibilidade</w:t>
             </w:r>
           </w:p>
         </w:tc>
@@ -538,38 +506,6 @@
                 <w:sz w:val="18"/>
               </w:rPr>
               <w:t>4</w:t>
-            </w:r>
-          </w:p>
-        </w:tc>
-        <w:tc>
-          <w:p>
-            <w:r>
-              <w:rPr>
-                <w:sz w:val="18"/>
-              </w:rPr>
-              <w:t>Administrador: clica em 'Adicionar Compatibilidade'</w:t>
-            </w:r>
-          </w:p>
-        </w:tc>
-        <w:tc>
-          <w:p>
-            <w:r>
-              <w:rPr>
-                <w:sz w:val="18"/>
-              </w:rPr>
-              <w:t>SYSTEM exibe a tela de cadastro de Compatibilidade</w:t>
-            </w:r>
-          </w:p>
-        </w:tc>
-      </w:tr>
-      <w:tr>
-        <w:tc>
-          <w:p>
-            <w:r>
-              <w:rPr>
-                <w:sz w:val="18"/>
-              </w:rPr>
-              <w:t>5</w:t>
             </w:r>
           </w:p>
         </w:tc>
@@ -610,7 +546,7 @@
           <w:sz w:val="24"/>
           <w:color w:val="2B6CB0"/>
         </w:rPr>
-        <w:t>[TC3] Alternative Flow 2: Cancela registro de nova Compatibilidade</w:t>
+        <w:t>[TC3] Alternative Flow 2: Cancelar registro de nova Compatibilidade</w:t>
       </w:r>
     </w:p>
     <w:p>
@@ -737,17 +673,17 @@
               <w:rPr>
                 <w:sz w:val="18"/>
               </w:rPr>
-              <w:t>Administrador: abre tela inicial do sistema</w:t>
-            </w:r>
-          </w:p>
-        </w:tc>
-        <w:tc>
-          <w:p>
-            <w:r>
-              <w:rPr>
-                <w:sz w:val="18"/>
-              </w:rPr>
-              <w:t>SYSTEM exibe tela inicial do sistema</w:t>
+              <w:t>Administrador: Clicar na opcao 'Compatibilidade' no menu da tela principal</w:t>
+            </w:r>
+          </w:p>
+        </w:tc>
+        <w:tc>
+          <w:p>
+            <w:r>
+              <w:rPr>
+                <w:sz w:val="18"/>
+              </w:rPr>
+              <w:t>SYSTEM exibe a tela de listagem das Compatibilidades</w:t>
             </w:r>
           </w:p>
         </w:tc>
@@ -769,7 +705,39 @@
               <w:rPr>
                 <w:sz w:val="18"/>
               </w:rPr>
-              <w:t>Administrador: clica na opcao 'Compatibilidade' no menu da tela principal</w:t>
+              <w:t>Administrador: clica em 'Adicionar Compatibilidade'</w:t>
+            </w:r>
+          </w:p>
+        </w:tc>
+        <w:tc>
+          <w:p>
+            <w:r>
+              <w:rPr>
+                <w:sz w:val="18"/>
+              </w:rPr>
+              <w:t>SYSTEM exibe a tela de cadastro de Compatibilidade</w:t>
+            </w:r>
+          </w:p>
+        </w:tc>
+      </w:tr>
+      <w:tr>
+        <w:tc>
+          <w:p>
+            <w:r>
+              <w:rPr>
+                <w:sz w:val="18"/>
+              </w:rPr>
+              <w:t>3</w:t>
+            </w:r>
+          </w:p>
+        </w:tc>
+        <w:tc>
+          <w:p>
+            <w:r>
+              <w:rPr>
+                <w:sz w:val="18"/>
+              </w:rPr>
+              <w:t>Administrador: clica no botao Cancelar</w:t>
             </w:r>
           </w:p>
         </w:tc>
@@ -791,7 +759,7 @@
               <w:rPr>
                 <w:sz w:val="18"/>
               </w:rPr>
-              <w:t>3</w:t>
+              <w:t>4</w:t>
             </w:r>
           </w:p>
         </w:tc>
@@ -823,103 +791,7 @@
               <w:rPr>
                 <w:sz w:val="18"/>
               </w:rPr>
-              <w:t>4</w:t>
-            </w:r>
-          </w:p>
-        </w:tc>
-        <w:tc>
-          <w:p>
-            <w:r>
-              <w:rPr>
-                <w:sz w:val="18"/>
-              </w:rPr>
-              <w:t>Administrador: clica no botao 'Cancelar'</w:t>
-            </w:r>
-          </w:p>
-        </w:tc>
-        <w:tc>
-          <w:p>
-            <w:r>
-              <w:rPr>
-                <w:sz w:val="18"/>
-              </w:rPr>
-              <w:t>SYSTEM exibe tela inicial do sistema</w:t>
-            </w:r>
-          </w:p>
-        </w:tc>
-      </w:tr>
-      <w:tr>
-        <w:tc>
-          <w:p>
-            <w:r>
-              <w:rPr>
-                <w:sz w:val="18"/>
-              </w:rPr>
               <w:t>5</w:t>
-            </w:r>
-          </w:p>
-        </w:tc>
-        <w:tc>
-          <w:p>
-            <w:r>
-              <w:rPr>
-                <w:sz w:val="18"/>
-              </w:rPr>
-              <w:t>Administrador: clica na opcao 'Compatibilidade' no menu da tela principal</w:t>
-            </w:r>
-          </w:p>
-        </w:tc>
-        <w:tc>
-          <w:p>
-            <w:r>
-              <w:rPr>
-                <w:sz w:val="18"/>
-              </w:rPr>
-              <w:t>SYSTEM exibe a tela de listagem das Compatibilidades</w:t>
-            </w:r>
-          </w:p>
-        </w:tc>
-      </w:tr>
-      <w:tr>
-        <w:tc>
-          <w:p>
-            <w:r>
-              <w:rPr>
-                <w:sz w:val="18"/>
-              </w:rPr>
-              <w:t>6</w:t>
-            </w:r>
-          </w:p>
-        </w:tc>
-        <w:tc>
-          <w:p>
-            <w:r>
-              <w:rPr>
-                <w:sz w:val="18"/>
-              </w:rPr>
-              <w:t>Administrador: clica em 'Adicionar Compatibilidade'</w:t>
-            </w:r>
-          </w:p>
-        </w:tc>
-        <w:tc>
-          <w:p>
-            <w:r>
-              <w:rPr>
-                <w:sz w:val="18"/>
-              </w:rPr>
-              <w:t>SYSTEM exibe a tela de cadastro de Compatibilidade</w:t>
-            </w:r>
-          </w:p>
-        </w:tc>
-      </w:tr>
-      <w:tr>
-        <w:tc>
-          <w:p>
-            <w:r>
-              <w:rPr>
-                <w:sz w:val="18"/>
-              </w:rPr>
-              <w:t>7</w:t>
             </w:r>
           </w:p>
         </w:tc>
@@ -1087,17 +959,17 @@
               <w:rPr>
                 <w:sz w:val="18"/>
               </w:rPr>
-              <w:t>Administrador: abre tela inicial do sistema</w:t>
-            </w:r>
-          </w:p>
-        </w:tc>
-        <w:tc>
-          <w:p>
-            <w:r>
-              <w:rPr>
-                <w:sz w:val="18"/>
-              </w:rPr>
-              <w:t>SYSTEM exibe tela inicial do sistema</w:t>
+              <w:t>Administrador: Clicar na opcao 'Compatibilidade' no menu da tela principal</w:t>
+            </w:r>
+          </w:p>
+        </w:tc>
+        <w:tc>
+          <w:p>
+            <w:r>
+              <w:rPr>
+                <w:sz w:val="18"/>
+              </w:rPr>
+              <w:t>SYSTEM exibe a tela de listagem das Compatibilidades</w:t>
             </w:r>
           </w:p>
         </w:tc>
@@ -1119,17 +991,17 @@
               <w:rPr>
                 <w:sz w:val="18"/>
               </w:rPr>
-              <w:t>Administrador: clica na opcao 'Compatibilidade' no menu da tela principal</w:t>
-            </w:r>
-          </w:p>
-        </w:tc>
-        <w:tc>
-          <w:p>
-            <w:r>
-              <w:rPr>
-                <w:sz w:val="18"/>
-              </w:rPr>
-              <w:t>SYSTEM exibe a tela de listagem das Compatibilidades</w:t>
+              <w:t>Administrador: clica em 'Adicionar Compatibilidade'</w:t>
+            </w:r>
+          </w:p>
+        </w:tc>
+        <w:tc>
+          <w:p>
+            <w:r>
+              <w:rPr>
+                <w:sz w:val="18"/>
+              </w:rPr>
+              <w:t>SYSTEM exibe a tela de cadastro de Compatibilidade</w:t>
             </w:r>
           </w:p>
         </w:tc>
@@ -1151,17 +1023,17 @@
               <w:rPr>
                 <w:sz w:val="18"/>
               </w:rPr>
-              <w:t>Administrador: clica em 'Adicionar Compatibilidade'</w:t>
-            </w:r>
-          </w:p>
-        </w:tc>
-        <w:tc>
-          <w:p>
-            <w:r>
-              <w:rPr>
-                <w:sz w:val="18"/>
-              </w:rPr>
-              <w:t>SYSTEM exibe a tela de cadastro de Compatibilidade</w:t>
+              <w:t>Administrador: preenche os dados da Compatibilidade e clica em botao 'Registrar'</w:t>
+            </w:r>
+          </w:p>
+        </w:tc>
+        <w:tc>
+          <w:p>
+            <w:r>
+              <w:rPr>
+                <w:sz w:val="18"/>
+              </w:rPr>
+              <w:t>SYSTEM informa que os dados obrigatorios devem ser preenchidos</w:t>
             </w:r>
           </w:p>
         </w:tc>
@@ -1183,39 +1055,7 @@
               <w:rPr>
                 <w:sz w:val="18"/>
               </w:rPr>
-              <w:t>Administrador: preenche os dados da Compatibilidade e clica em botao 'Registrar'</w:t>
-            </w:r>
-          </w:p>
-        </w:tc>
-        <w:tc>
-          <w:p>
-            <w:r>
-              <w:rPr>
-                <w:sz w:val="18"/>
-              </w:rPr>
-              <w:t>SYSTEM informa que os dados obrigatorios devem ser preenchidos</w:t>
-            </w:r>
-          </w:p>
-        </w:tc>
-      </w:tr>
-      <w:tr>
-        <w:tc>
-          <w:p>
-            <w:r>
-              <w:rPr>
-                <w:sz w:val="18"/>
-              </w:rPr>
-              <w:t>5</w:t>
-            </w:r>
-          </w:p>
-        </w:tc>
-        <w:tc>
-          <w:p>
-            <w:r>
-              <w:rPr>
-                <w:sz w:val="18"/>
-              </w:rPr>
-              <w:t>Administrador: preenche dados obrigatorios e clica em 'Atualizar'</w:t>
+              <w:t>Administrador: preenche dados obrigatorios e clica em Atualizar</w:t>
             </w:r>
           </w:p>
         </w:tc>
@@ -1373,17 +1213,17 @@
               <w:rPr>
                 <w:sz w:val="18"/>
               </w:rPr>
-              <w:t>Administrador: abre tela inicial do sistema</w:t>
-            </w:r>
-          </w:p>
-        </w:tc>
-        <w:tc>
-          <w:p>
-            <w:r>
-              <w:rPr>
-                <w:sz w:val="18"/>
-              </w:rPr>
-              <w:t>SYSTEM exibe tela inicial do sistema</w:t>
+              <w:t>Administrador: Clicar na opcao 'Compatibilidade' no menu da tela principal</w:t>
+            </w:r>
+          </w:p>
+        </w:tc>
+        <w:tc>
+          <w:p>
+            <w:r>
+              <w:rPr>
+                <w:sz w:val="18"/>
+              </w:rPr>
+              <w:t>SYSTEM exibe a tela de listagem das Compatibilidades</w:t>
             </w:r>
           </w:p>
         </w:tc>
@@ -1405,17 +1245,17 @@
               <w:rPr>
                 <w:sz w:val="18"/>
               </w:rPr>
-              <w:t>Administrador: clica na opcao 'Compatibilidade' no menu da tela principal</w:t>
-            </w:r>
-          </w:p>
-        </w:tc>
-        <w:tc>
-          <w:p>
-            <w:r>
-              <w:rPr>
-                <w:sz w:val="18"/>
-              </w:rPr>
-              <w:t>SYSTEM exibe a tela de listagem das Compatibilidades</w:t>
+              <w:t>Administrador: clica em 'Adicionar Compatibilidade'</w:t>
+            </w:r>
+          </w:p>
+        </w:tc>
+        <w:tc>
+          <w:p>
+            <w:r>
+              <w:rPr>
+                <w:sz w:val="18"/>
+              </w:rPr>
+              <w:t>SYSTEM exibe a tela de cadastro de Compatibilidade</w:t>
             </w:r>
           </w:p>
         </w:tc>
@@ -1437,17 +1277,17 @@
               <w:rPr>
                 <w:sz w:val="18"/>
               </w:rPr>
-              <w:t>Administrador: clica em 'Adicionar Compatibilidade'</w:t>
-            </w:r>
-          </w:p>
-        </w:tc>
-        <w:tc>
-          <w:p>
-            <w:r>
-              <w:rPr>
-                <w:sz w:val="18"/>
-              </w:rPr>
-              <w:t>SYSTEM exibe a tela de cadastro de Compatibilidade</w:t>
+              <w:t>Administrador: preenche os dados da Compatibilidade e clica em botao 'Registrar'</w:t>
+            </w:r>
+          </w:p>
+        </w:tc>
+        <w:tc>
+          <w:p>
+            <w:r>
+              <w:rPr>
+                <w:sz w:val="18"/>
+              </w:rPr>
+              <w:t>SYSTEM alerta que Tipo de Mercadoria e invalido</w:t>
             </w:r>
           </w:p>
         </w:tc>
@@ -1469,39 +1309,7 @@
               <w:rPr>
                 <w:sz w:val="18"/>
               </w:rPr>
-              <w:t>Administrador: preenche os dados da Compatibilidade e clica em botao 'Registrar'</w:t>
-            </w:r>
-          </w:p>
-        </w:tc>
-        <w:tc>
-          <w:p>
-            <w:r>
-              <w:rPr>
-                <w:sz w:val="18"/>
-              </w:rPr>
-              <w:t>SYSTEM alerta que Tipo de Mercadoria e invalido</w:t>
-            </w:r>
-          </w:p>
-        </w:tc>
-      </w:tr>
-      <w:tr>
-        <w:tc>
-          <w:p>
-            <w:r>
-              <w:rPr>
-                <w:sz w:val="18"/>
-              </w:rPr>
-              <w:t>5</w:t>
-            </w:r>
-          </w:p>
-        </w:tc>
-        <w:tc>
-          <w:p>
-            <w:r>
-              <w:rPr>
-                <w:sz w:val="18"/>
-              </w:rPr>
-              <w:t>Administrador: preenche um Tipo de Mercadoria valido e clica em 'Atualizar'</w:t>
+              <w:t>Administrador: preenche um Tipo de Mercadoria valido e clica em Atualizar</w:t>
             </w:r>
           </w:p>
         </w:tc>
@@ -1659,17 +1467,17 @@
               <w:rPr>
                 <w:sz w:val="18"/>
               </w:rPr>
-              <w:t>Administrador: abre tela inicial do sistema</w:t>
-            </w:r>
-          </w:p>
-        </w:tc>
-        <w:tc>
-          <w:p>
-            <w:r>
-              <w:rPr>
-                <w:sz w:val="18"/>
-              </w:rPr>
-              <w:t>SYSTEM exibe tela inicial do sistema</w:t>
+              <w:t>Administrador: Clicar na opcao 'Compatibilidade' no menu da tela principal</w:t>
+            </w:r>
+          </w:p>
+        </w:tc>
+        <w:tc>
+          <w:p>
+            <w:r>
+              <w:rPr>
+                <w:sz w:val="18"/>
+              </w:rPr>
+              <w:t>SYSTEM exibe a tela de listagem das Compatibilidades</w:t>
             </w:r>
           </w:p>
         </w:tc>
@@ -1691,17 +1499,17 @@
               <w:rPr>
                 <w:sz w:val="18"/>
               </w:rPr>
-              <w:t>Administrador: clica na opcao 'Compatibilidade' no menu da tela principal</w:t>
-            </w:r>
-          </w:p>
-        </w:tc>
-        <w:tc>
-          <w:p>
-            <w:r>
-              <w:rPr>
-                <w:sz w:val="18"/>
-              </w:rPr>
-              <w:t>SYSTEM exibe a tela de listagem das Compatibilidades</w:t>
+              <w:t>Administrador: clica em 'Adicionar Compatibilidade'</w:t>
+            </w:r>
+          </w:p>
+        </w:tc>
+        <w:tc>
+          <w:p>
+            <w:r>
+              <w:rPr>
+                <w:sz w:val="18"/>
+              </w:rPr>
+              <w:t>SYSTEM exibe a tela de cadastro de Compatibilidade</w:t>
             </w:r>
           </w:p>
         </w:tc>
@@ -1723,17 +1531,17 @@
               <w:rPr>
                 <w:sz w:val="18"/>
               </w:rPr>
-              <w:t>Administrador: clica em 'Adicionar Compatibilidade'</w:t>
-            </w:r>
-          </w:p>
-        </w:tc>
-        <w:tc>
-          <w:p>
-            <w:r>
-              <w:rPr>
-                <w:sz w:val="18"/>
-              </w:rPr>
-              <w:t>SYSTEM exibe a tela de cadastro de Compatibilidade</w:t>
+              <w:t>Administrador: preenche os dados da Compatibilidade e clica em botao 'Registrar'</w:t>
+            </w:r>
+          </w:p>
+        </w:tc>
+        <w:tc>
+          <w:p>
+            <w:r>
+              <w:rPr>
+                <w:sz w:val="18"/>
+              </w:rPr>
+              <w:t>SYSTEM alerta que NCM e invalido</w:t>
             </w:r>
           </w:p>
         </w:tc>
@@ -1755,39 +1563,7 @@
               <w:rPr>
                 <w:sz w:val="18"/>
               </w:rPr>
-              <w:t>Administrador: preenche os dados da Compatibilidade e clica em botao 'Registrar'</w:t>
-            </w:r>
-          </w:p>
-        </w:tc>
-        <w:tc>
-          <w:p>
-            <w:r>
-              <w:rPr>
-                <w:sz w:val="18"/>
-              </w:rPr>
-              <w:t>SYSTEM alerta que NCM e invalido</w:t>
-            </w:r>
-          </w:p>
-        </w:tc>
-      </w:tr>
-      <w:tr>
-        <w:tc>
-          <w:p>
-            <w:r>
-              <w:rPr>
-                <w:sz w:val="18"/>
-              </w:rPr>
-              <w:t>5</w:t>
-            </w:r>
-          </w:p>
-        </w:tc>
-        <w:tc>
-          <w:p>
-            <w:r>
-              <w:rPr>
-                <w:sz w:val="18"/>
-              </w:rPr>
-              <w:t>Administrador: preenche um NCM valido e clica em 'Atualizar'</w:t>
+              <w:t>Administrador: preenche um NCM valido e clica em Atualizar</w:t>
             </w:r>
           </w:p>
         </w:tc>

</xml_diff>

<commit_message>
feat(viceri-study): publish specification and test suite v1.6
</commit_message>
<xml_diff>
--- a/output/docx/AdministradorAdicionaCompatibilidade.docx
+++ b/output/docx/AdministradorAdicionaCompatibilidade.docx
@@ -292,7 +292,7 @@
           <w:sz w:val="24"/>
           <w:color w:val="2B6CB0"/>
         </w:rPr>
-        <w:t>[TC2] Alternative Flow 1: Volta para listagem de Compatibilidades</w:t>
+        <w:t>[TC2] Exception Flow 1: Nao insere algum dado obrigatorio'</w:t>
       </w:r>
     </w:p>
     <w:p>
@@ -328,7 +328,7 @@
         <w:rPr>
           <w:sz w:val="20"/>
         </w:rPr>
-        <w:t>A nova Compatibilidade esta adicionada ao banco.</w:t>
+        <w:t>Flow interrupted due to exception / error</w:t>
       </w:r>
     </w:p>
     <w:tbl>
@@ -451,17 +451,17 @@
               <w:rPr>
                 <w:sz w:val="18"/>
               </w:rPr>
-              <w:t>Administrador: clica no botao Voltar</w:t>
-            </w:r>
-          </w:p>
-        </w:tc>
-        <w:tc>
-          <w:p>
-            <w:r>
-              <w:rPr>
-                <w:sz w:val="18"/>
-              </w:rPr>
-              <w:t>SYSTEM exibe a tela de listagem das Compatibilidades</w:t>
+              <w:t>Administrador: clica em 'Adicionar Compatibilidade'</w:t>
+            </w:r>
+          </w:p>
+        </w:tc>
+        <w:tc>
+          <w:p>
+            <w:r>
+              <w:rPr>
+                <w:sz w:val="18"/>
+              </w:rPr>
+              <w:t>SYSTEM exibe a tela de cadastro de Compatibilidade</w:t>
             </w:r>
           </w:p>
         </w:tc>
@@ -483,17 +483,17 @@
               <w:rPr>
                 <w:sz w:val="18"/>
               </w:rPr>
-              <w:t>Administrador: clica em 'Adicionar Compatibilidade'</w:t>
-            </w:r>
-          </w:p>
-        </w:tc>
-        <w:tc>
-          <w:p>
-            <w:r>
-              <w:rPr>
-                <w:sz w:val="18"/>
-              </w:rPr>
-              <w:t>SYSTEM exibe a tela de cadastro de Compatibilidade</w:t>
+              <w:t>Administrador: preenche os dados da Compatibilidade e clica em botao 'Registrar'</w:t>
+            </w:r>
+          </w:p>
+        </w:tc>
+        <w:tc>
+          <w:p>
+            <w:r>
+              <w:rPr>
+                <w:sz w:val="18"/>
+              </w:rPr>
+              <w:t>SYSTEM informa que os dados obrigatorios devem ser preenchidos</w:t>
             </w:r>
           </w:p>
         </w:tc>
@@ -515,17 +515,17 @@
               <w:rPr>
                 <w:sz w:val="18"/>
               </w:rPr>
-              <w:t>Administrador: preenche os dados da Compatibilidade e clica em botao 'Registrar'</w:t>
-            </w:r>
-          </w:p>
-        </w:tc>
-        <w:tc>
-          <w:p>
-            <w:r>
-              <w:rPr>
-                <w:sz w:val="18"/>
-              </w:rPr>
-              <w:t>SYSTEM notifica usuario que os nova Compatibilidade foi adicionada com sucesso</w:t>
+              <w:t>Administrador: preenche dados obrigatorios e clica em Atualizar</w:t>
+            </w:r>
+          </w:p>
+        </w:tc>
+        <w:tc>
+          <w:p>
+            <w:r>
+              <w:rPr>
+                <w:sz w:val="18"/>
+              </w:rPr>
+              <w:t>SYSTEM processes action successfully</w:t>
             </w:r>
           </w:p>
         </w:tc>
@@ -546,7 +546,7 @@
           <w:sz w:val="24"/>
           <w:color w:val="2B6CB0"/>
         </w:rPr>
-        <w:t>[TC3] Alternative Flow 2: Cancelar registro de nova Compatibilidade</w:t>
+        <w:t>[TC3] Exception Flow 2: Usuario insere Tipo de Mercadoria invalido</w:t>
       </w:r>
     </w:p>
     <w:p>
@@ -582,7 +582,7 @@
         <w:rPr>
           <w:sz w:val="20"/>
         </w:rPr>
-        <w:t>A nova Compatibilidade esta adicionada ao banco.</w:t>
+        <w:t>Flow interrupted due to exception / error</w:t>
       </w:r>
     </w:p>
     <w:tbl>
@@ -737,17 +737,17 @@
               <w:rPr>
                 <w:sz w:val="18"/>
               </w:rPr>
-              <w:t>Administrador: clica no botao Cancelar</w:t>
-            </w:r>
-          </w:p>
-        </w:tc>
-        <w:tc>
-          <w:p>
-            <w:r>
-              <w:rPr>
-                <w:sz w:val="18"/>
-              </w:rPr>
-              <w:t>SYSTEM exibe a tela de listagem das Compatibilidades</w:t>
+              <w:t>Administrador: preenche os dados da Compatibilidade e clica em botao 'Registrar'</w:t>
+            </w:r>
+          </w:p>
+        </w:tc>
+        <w:tc>
+          <w:p>
+            <w:r>
+              <w:rPr>
+                <w:sz w:val="18"/>
+              </w:rPr>
+              <w:t>SYSTEM alerta que Tipo de Mercadoria e invalido</w:t>
             </w:r>
           </w:p>
         </w:tc>
@@ -769,49 +769,17 @@
               <w:rPr>
                 <w:sz w:val="18"/>
               </w:rPr>
-              <w:t>Administrador: clica em 'Adicionar Compatibilidade'</w:t>
-            </w:r>
-          </w:p>
-        </w:tc>
-        <w:tc>
-          <w:p>
-            <w:r>
-              <w:rPr>
-                <w:sz w:val="18"/>
-              </w:rPr>
-              <w:t>SYSTEM exibe a tela de cadastro de Compatibilidade</w:t>
-            </w:r>
-          </w:p>
-        </w:tc>
-      </w:tr>
-      <w:tr>
-        <w:tc>
-          <w:p>
-            <w:r>
-              <w:rPr>
-                <w:sz w:val="18"/>
-              </w:rPr>
-              <w:t>5</w:t>
-            </w:r>
-          </w:p>
-        </w:tc>
-        <w:tc>
-          <w:p>
-            <w:r>
-              <w:rPr>
-                <w:sz w:val="18"/>
-              </w:rPr>
-              <w:t>Administrador: preenche os dados da Compatibilidade e clica em botao 'Registrar'</w:t>
-            </w:r>
-          </w:p>
-        </w:tc>
-        <w:tc>
-          <w:p>
-            <w:r>
-              <w:rPr>
-                <w:sz w:val="18"/>
-              </w:rPr>
-              <w:t>SYSTEM notifica usuario que os nova Compatibilidade foi adicionada com sucesso</w:t>
+              <w:t>Administrador: preenche um Tipo de Mercadoria valido e clica em Atualizar</w:t>
+            </w:r>
+          </w:p>
+        </w:tc>
+        <w:tc>
+          <w:p>
+            <w:r>
+              <w:rPr>
+                <w:sz w:val="18"/>
+              </w:rPr>
+              <w:t>SYSTEM processes action successfully</w:t>
             </w:r>
           </w:p>
         </w:tc>
@@ -832,7 +800,7 @@
           <w:sz w:val="24"/>
           <w:color w:val="2B6CB0"/>
         </w:rPr>
-        <w:t>[TC4] Exception Flow 1: Nao insere algum dado obrigatorio'</w:t>
+        <w:t>[TC4] Exception Flow 3: Usuario insere NCM invalido</w:t>
       </w:r>
     </w:p>
     <w:p>
@@ -1033,514 +1001,6 @@
               <w:rPr>
                 <w:sz w:val="18"/>
               </w:rPr>
-              <w:t>SYSTEM informa que os dados obrigatorios devem ser preenchidos</w:t>
-            </w:r>
-          </w:p>
-        </w:tc>
-      </w:tr>
-      <w:tr>
-        <w:tc>
-          <w:p>
-            <w:r>
-              <w:rPr>
-                <w:sz w:val="18"/>
-              </w:rPr>
-              <w:t>4</w:t>
-            </w:r>
-          </w:p>
-        </w:tc>
-        <w:tc>
-          <w:p>
-            <w:r>
-              <w:rPr>
-                <w:sz w:val="18"/>
-              </w:rPr>
-              <w:t>Administrador: preenche dados obrigatorios e clica em Atualizar</w:t>
-            </w:r>
-          </w:p>
-        </w:tc>
-        <w:tc>
-          <w:p>
-            <w:r>
-              <w:rPr>
-                <w:sz w:val="18"/>
-              </w:rPr>
-              <w:t>SYSTEM processes action successfully</w:t>
-            </w:r>
-          </w:p>
-        </w:tc>
-      </w:tr>
-    </w:tbl>
-    <w:p>
-      <w:r>
-        <w:br/>
-      </w:r>
-    </w:p>
-    <w:p>
-      <w:pPr>
-        <w:spacing w:before="180" w:after="60"/>
-      </w:pPr>
-      <w:r>
-        <w:rPr>
-          <w:b w:val="on"/>
-          <w:sz w:val="24"/>
-          <w:color w:val="2B6CB0"/>
-        </w:rPr>
-        <w:t>[TC5] Exception Flow 2: Usuario insere Tipo de Mercadoria invalido</w:t>
-      </w:r>
-    </w:p>
-    <w:p>
-      <w:pPr>
-        <w:spacing w:after="40"/>
-      </w:pPr>
-      <w:r>
-        <w:rPr>
-          <w:b w:val="on"/>
-          <w:sz w:val="20"/>
-        </w:rPr>
-        <w:t xml:space="preserve">Preconditions: </w:t>
-      </w:r>
-      <w:r>
-        <w:rPr>
-          <w:sz w:val="20"/>
-        </w:rPr>
-        <w:t>Usuario Administrador esta logado no sistema.</w:t>
-      </w:r>
-    </w:p>
-    <w:p>
-      <w:pPr>
-        <w:spacing w:after="40"/>
-      </w:pPr>
-      <w:r>
-        <w:rPr>
-          <w:b w:val="on"/>
-          <w:sz w:val="20"/>
-        </w:rPr>
-        <w:t xml:space="preserve">Postconditions: </w:t>
-      </w:r>
-      <w:r>
-        <w:rPr>
-          <w:sz w:val="20"/>
-        </w:rPr>
-        <w:t>Flow interrupted due to exception / error</w:t>
-      </w:r>
-    </w:p>
-    <w:tbl>
-      <w:tblPr>
-        <w:tblW w:w="5000" w:type="pct"/>
-        <w:tblBorders>
-          <w:top w:val="single"/>
-          <w:left w:val="single"/>
-          <w:bottom w:val="single"/>
-          <w:right w:val="single"/>
-          <w:insideH w:val="single"/>
-          <w:insideV w:val="single"/>
-        </w:tblBorders>
-      </w:tblPr>
-      <w:tr>
-        <w:tc>
-          <w:tcPr>
-            <w:tcW w:w="1200" w:type="dxa"/>
-            <w:shd w:color="auto" w:val="clear" w:fill="2B6CB0"/>
-          </w:tcPr>
-          <w:p>
-            <w:pPr>
-              <w:jc w:val="left"/>
-            </w:pPr>
-            <w:r>
-              <w:rPr>
-                <w:b w:val="on"/>
-                <w:sz w:val="20"/>
-                <w:color w:val="FFFFFF"/>
-              </w:rPr>
-              <w:t>Step #</w:t>
-            </w:r>
-          </w:p>
-        </w:tc>
-        <w:tc>
-          <w:tcPr>
-            <w:tcW w:w="4500" w:type="dxa"/>
-            <w:shd w:color="auto" w:val="clear" w:fill="2B6CB0"/>
-          </w:tcPr>
-          <w:p>
-            <w:pPr>
-              <w:jc w:val="left"/>
-            </w:pPr>
-            <w:r>
-              <w:rPr>
-                <w:b w:val="on"/>
-                <w:sz w:val="20"/>
-                <w:color w:val="FFFFFF"/>
-              </w:rPr>
-              <w:t>Actor Action</w:t>
-            </w:r>
-          </w:p>
-        </w:tc>
-        <w:tc>
-          <w:tcPr>
-            <w:tcW w:w="4500" w:type="dxa"/>
-            <w:shd w:color="auto" w:val="clear" w:fill="2B6CB0"/>
-          </w:tcPr>
-          <w:p>
-            <w:pPr>
-              <w:jc w:val="left"/>
-            </w:pPr>
-            <w:r>
-              <w:rPr>
-                <w:b w:val="on"/>
-                <w:sz w:val="20"/>
-                <w:color w:val="FFFFFF"/>
-              </w:rPr>
-              <w:t>Expected Result (System)</w:t>
-            </w:r>
-          </w:p>
-        </w:tc>
-      </w:tr>
-      <w:tr>
-        <w:tc>
-          <w:p>
-            <w:r>
-              <w:rPr>
-                <w:sz w:val="18"/>
-              </w:rPr>
-              <w:t>1</w:t>
-            </w:r>
-          </w:p>
-        </w:tc>
-        <w:tc>
-          <w:p>
-            <w:r>
-              <w:rPr>
-                <w:sz w:val="18"/>
-              </w:rPr>
-              <w:t>Administrador: Clicar na opcao 'Compatibilidade' no menu da tela principal</w:t>
-            </w:r>
-          </w:p>
-        </w:tc>
-        <w:tc>
-          <w:p>
-            <w:r>
-              <w:rPr>
-                <w:sz w:val="18"/>
-              </w:rPr>
-              <w:t>SYSTEM exibe a tela de listagem das Compatibilidades</w:t>
-            </w:r>
-          </w:p>
-        </w:tc>
-      </w:tr>
-      <w:tr>
-        <w:tc>
-          <w:p>
-            <w:r>
-              <w:rPr>
-                <w:sz w:val="18"/>
-              </w:rPr>
-              <w:t>2</w:t>
-            </w:r>
-          </w:p>
-        </w:tc>
-        <w:tc>
-          <w:p>
-            <w:r>
-              <w:rPr>
-                <w:sz w:val="18"/>
-              </w:rPr>
-              <w:t>Administrador: clica em 'Adicionar Compatibilidade'</w:t>
-            </w:r>
-          </w:p>
-        </w:tc>
-        <w:tc>
-          <w:p>
-            <w:r>
-              <w:rPr>
-                <w:sz w:val="18"/>
-              </w:rPr>
-              <w:t>SYSTEM exibe a tela de cadastro de Compatibilidade</w:t>
-            </w:r>
-          </w:p>
-        </w:tc>
-      </w:tr>
-      <w:tr>
-        <w:tc>
-          <w:p>
-            <w:r>
-              <w:rPr>
-                <w:sz w:val="18"/>
-              </w:rPr>
-              <w:t>3</w:t>
-            </w:r>
-          </w:p>
-        </w:tc>
-        <w:tc>
-          <w:p>
-            <w:r>
-              <w:rPr>
-                <w:sz w:val="18"/>
-              </w:rPr>
-              <w:t>Administrador: preenche os dados da Compatibilidade e clica em botao 'Registrar'</w:t>
-            </w:r>
-          </w:p>
-        </w:tc>
-        <w:tc>
-          <w:p>
-            <w:r>
-              <w:rPr>
-                <w:sz w:val="18"/>
-              </w:rPr>
-              <w:t>SYSTEM alerta que Tipo de Mercadoria e invalido</w:t>
-            </w:r>
-          </w:p>
-        </w:tc>
-      </w:tr>
-      <w:tr>
-        <w:tc>
-          <w:p>
-            <w:r>
-              <w:rPr>
-                <w:sz w:val="18"/>
-              </w:rPr>
-              <w:t>4</w:t>
-            </w:r>
-          </w:p>
-        </w:tc>
-        <w:tc>
-          <w:p>
-            <w:r>
-              <w:rPr>
-                <w:sz w:val="18"/>
-              </w:rPr>
-              <w:t>Administrador: preenche um Tipo de Mercadoria valido e clica em Atualizar</w:t>
-            </w:r>
-          </w:p>
-        </w:tc>
-        <w:tc>
-          <w:p>
-            <w:r>
-              <w:rPr>
-                <w:sz w:val="18"/>
-              </w:rPr>
-              <w:t>SYSTEM processes action successfully</w:t>
-            </w:r>
-          </w:p>
-        </w:tc>
-      </w:tr>
-    </w:tbl>
-    <w:p>
-      <w:r>
-        <w:br/>
-      </w:r>
-    </w:p>
-    <w:p>
-      <w:pPr>
-        <w:spacing w:before="180" w:after="60"/>
-      </w:pPr>
-      <w:r>
-        <w:rPr>
-          <w:b w:val="on"/>
-          <w:sz w:val="24"/>
-          <w:color w:val="2B6CB0"/>
-        </w:rPr>
-        <w:t>[TC6] Exception Flow 3: Usuario insere NCM invalido</w:t>
-      </w:r>
-    </w:p>
-    <w:p>
-      <w:pPr>
-        <w:spacing w:after="40"/>
-      </w:pPr>
-      <w:r>
-        <w:rPr>
-          <w:b w:val="on"/>
-          <w:sz w:val="20"/>
-        </w:rPr>
-        <w:t xml:space="preserve">Preconditions: </w:t>
-      </w:r>
-      <w:r>
-        <w:rPr>
-          <w:sz w:val="20"/>
-        </w:rPr>
-        <w:t>Usuario Administrador esta logado no sistema.</w:t>
-      </w:r>
-    </w:p>
-    <w:p>
-      <w:pPr>
-        <w:spacing w:after="40"/>
-      </w:pPr>
-      <w:r>
-        <w:rPr>
-          <w:b w:val="on"/>
-          <w:sz w:val="20"/>
-        </w:rPr>
-        <w:t xml:space="preserve">Postconditions: </w:t>
-      </w:r>
-      <w:r>
-        <w:rPr>
-          <w:sz w:val="20"/>
-        </w:rPr>
-        <w:t>Flow interrupted due to exception / error</w:t>
-      </w:r>
-    </w:p>
-    <w:tbl>
-      <w:tblPr>
-        <w:tblW w:w="5000" w:type="pct"/>
-        <w:tblBorders>
-          <w:top w:val="single"/>
-          <w:left w:val="single"/>
-          <w:bottom w:val="single"/>
-          <w:right w:val="single"/>
-          <w:insideH w:val="single"/>
-          <w:insideV w:val="single"/>
-        </w:tblBorders>
-      </w:tblPr>
-      <w:tr>
-        <w:tc>
-          <w:tcPr>
-            <w:tcW w:w="1200" w:type="dxa"/>
-            <w:shd w:color="auto" w:val="clear" w:fill="2B6CB0"/>
-          </w:tcPr>
-          <w:p>
-            <w:pPr>
-              <w:jc w:val="left"/>
-            </w:pPr>
-            <w:r>
-              <w:rPr>
-                <w:b w:val="on"/>
-                <w:sz w:val="20"/>
-                <w:color w:val="FFFFFF"/>
-              </w:rPr>
-              <w:t>Step #</w:t>
-            </w:r>
-          </w:p>
-        </w:tc>
-        <w:tc>
-          <w:tcPr>
-            <w:tcW w:w="4500" w:type="dxa"/>
-            <w:shd w:color="auto" w:val="clear" w:fill="2B6CB0"/>
-          </w:tcPr>
-          <w:p>
-            <w:pPr>
-              <w:jc w:val="left"/>
-            </w:pPr>
-            <w:r>
-              <w:rPr>
-                <w:b w:val="on"/>
-                <w:sz w:val="20"/>
-                <w:color w:val="FFFFFF"/>
-              </w:rPr>
-              <w:t>Actor Action</w:t>
-            </w:r>
-          </w:p>
-        </w:tc>
-        <w:tc>
-          <w:tcPr>
-            <w:tcW w:w="4500" w:type="dxa"/>
-            <w:shd w:color="auto" w:val="clear" w:fill="2B6CB0"/>
-          </w:tcPr>
-          <w:p>
-            <w:pPr>
-              <w:jc w:val="left"/>
-            </w:pPr>
-            <w:r>
-              <w:rPr>
-                <w:b w:val="on"/>
-                <w:sz w:val="20"/>
-                <w:color w:val="FFFFFF"/>
-              </w:rPr>
-              <w:t>Expected Result (System)</w:t>
-            </w:r>
-          </w:p>
-        </w:tc>
-      </w:tr>
-      <w:tr>
-        <w:tc>
-          <w:p>
-            <w:r>
-              <w:rPr>
-                <w:sz w:val="18"/>
-              </w:rPr>
-              <w:t>1</w:t>
-            </w:r>
-          </w:p>
-        </w:tc>
-        <w:tc>
-          <w:p>
-            <w:r>
-              <w:rPr>
-                <w:sz w:val="18"/>
-              </w:rPr>
-              <w:t>Administrador: Clicar na opcao 'Compatibilidade' no menu da tela principal</w:t>
-            </w:r>
-          </w:p>
-        </w:tc>
-        <w:tc>
-          <w:p>
-            <w:r>
-              <w:rPr>
-                <w:sz w:val="18"/>
-              </w:rPr>
-              <w:t>SYSTEM exibe a tela de listagem das Compatibilidades</w:t>
-            </w:r>
-          </w:p>
-        </w:tc>
-      </w:tr>
-      <w:tr>
-        <w:tc>
-          <w:p>
-            <w:r>
-              <w:rPr>
-                <w:sz w:val="18"/>
-              </w:rPr>
-              <w:t>2</w:t>
-            </w:r>
-          </w:p>
-        </w:tc>
-        <w:tc>
-          <w:p>
-            <w:r>
-              <w:rPr>
-                <w:sz w:val="18"/>
-              </w:rPr>
-              <w:t>Administrador: clica em 'Adicionar Compatibilidade'</w:t>
-            </w:r>
-          </w:p>
-        </w:tc>
-        <w:tc>
-          <w:p>
-            <w:r>
-              <w:rPr>
-                <w:sz w:val="18"/>
-              </w:rPr>
-              <w:t>SYSTEM exibe a tela de cadastro de Compatibilidade</w:t>
-            </w:r>
-          </w:p>
-        </w:tc>
-      </w:tr>
-      <w:tr>
-        <w:tc>
-          <w:p>
-            <w:r>
-              <w:rPr>
-                <w:sz w:val="18"/>
-              </w:rPr>
-              <w:t>3</w:t>
-            </w:r>
-          </w:p>
-        </w:tc>
-        <w:tc>
-          <w:p>
-            <w:r>
-              <w:rPr>
-                <w:sz w:val="18"/>
-              </w:rPr>
-              <w:t>Administrador: preenche os dados da Compatibilidade e clica em botao 'Registrar'</w:t>
-            </w:r>
-          </w:p>
-        </w:tc>
-        <w:tc>
-          <w:p>
-            <w:r>
-              <w:rPr>
-                <w:sz w:val="18"/>
-              </w:rPr>
               <w:t>SYSTEM alerta que NCM e invalido</w:t>
             </w:r>
           </w:p>

</xml_diff>